<commit_message>
Resume and Job matching
</commit_message>
<xml_diff>
--- a/RoadMap.docx
+++ b/RoadMap.docx
@@ -131,6 +131,7 @@
           <w:rFonts w:ascii="Times New Roman" w:eastAsia="Times New Roman" w:hAnsi="Times New Roman" w:cs="Times New Roman"/>
           <w:b/>
           <w:bCs/>
+          <w:color w:val="538135" w:themeColor="accent6" w:themeShade="BF"/>
           <w:kern w:val="36"/>
           <w:sz w:val="48"/>
           <w:szCs w:val="48"/>
@@ -141,6 +142,7 @@
           <w:rFonts w:ascii="Segoe UI Symbol" w:eastAsia="Times New Roman" w:hAnsi="Segoe UI Symbol" w:cs="Segoe UI Symbol"/>
           <w:b/>
           <w:bCs/>
+          <w:color w:val="538135" w:themeColor="accent6" w:themeShade="BF"/>
           <w:kern w:val="36"/>
           <w:sz w:val="48"/>
           <w:szCs w:val="48"/>
@@ -152,12 +154,15 @@
           <w:rFonts w:ascii="Times New Roman" w:eastAsia="Times New Roman" w:hAnsi="Times New Roman" w:cs="Times New Roman"/>
           <w:b/>
           <w:bCs/>
+          <w:color w:val="538135" w:themeColor="accent6" w:themeShade="BF"/>
           <w:kern w:val="36"/>
           <w:sz w:val="48"/>
           <w:szCs w:val="48"/>
         </w:rPr>
         <w:t xml:space="preserve"> PHASE 1 — Backend Foundation (Day 1–10)</w:t>
       </w:r>
+      <w:bookmarkStart w:id="0" w:name="_GoBack"/>
+      <w:bookmarkEnd w:id="0"/>
     </w:p>
     <w:p>
       <w:pPr>
@@ -2015,8 +2020,6 @@
         </w:rPr>
         <w:t>🧩 Day 7 — Job Scraper Service</w:t>
       </w:r>
-      <w:bookmarkStart w:id="0" w:name="_GoBack"/>
-      <w:bookmarkEnd w:id="0"/>
     </w:p>
     <w:p>
       <w:pPr>
@@ -2316,6 +2319,7 @@
           <w:rFonts w:ascii="Times New Roman" w:eastAsia="Times New Roman" w:hAnsi="Times New Roman" w:cs="Times New Roman"/>
           <w:b/>
           <w:bCs/>
+          <w:color w:val="538135" w:themeColor="accent6" w:themeShade="BF"/>
           <w:sz w:val="36"/>
           <w:szCs w:val="36"/>
         </w:rPr>
@@ -2325,6 +2329,7 @@
           <w:rFonts w:ascii="Times New Roman" w:eastAsia="Times New Roman" w:hAnsi="Times New Roman" w:cs="Times New Roman"/>
           <w:b/>
           <w:bCs/>
+          <w:color w:val="538135" w:themeColor="accent6" w:themeShade="BF"/>
           <w:sz w:val="36"/>
           <w:szCs w:val="36"/>
         </w:rPr>
@@ -2368,7 +2373,6 @@
           <w:sz w:val="24"/>
           <w:szCs w:val="24"/>
         </w:rPr>
-        <w:lastRenderedPageBreak/>
         <w:t>Compare skill overlap</w:t>
       </w:r>
     </w:p>
@@ -2658,6 +2662,7 @@
           <w:rFonts w:ascii="Times New Roman" w:eastAsia="Times New Roman" w:hAnsi="Times New Roman" w:cs="Times New Roman"/>
           <w:b/>
           <w:bCs/>
+          <w:color w:val="538135" w:themeColor="accent6" w:themeShade="BF"/>
           <w:sz w:val="36"/>
           <w:szCs w:val="36"/>
         </w:rPr>
@@ -2667,6 +2672,7 @@
           <w:rFonts w:ascii="Times New Roman" w:eastAsia="Times New Roman" w:hAnsi="Times New Roman" w:cs="Times New Roman"/>
           <w:b/>
           <w:bCs/>
+          <w:color w:val="538135" w:themeColor="accent6" w:themeShade="BF"/>
           <w:sz w:val="36"/>
           <w:szCs w:val="36"/>
         </w:rPr>
@@ -2929,6 +2935,7 @@
           <w:rFonts w:ascii="Times New Roman" w:eastAsia="Times New Roman" w:hAnsi="Times New Roman" w:cs="Times New Roman"/>
           <w:b/>
           <w:bCs/>
+          <w:color w:val="538135" w:themeColor="accent6" w:themeShade="BF"/>
           <w:sz w:val="36"/>
           <w:szCs w:val="36"/>
         </w:rPr>
@@ -2938,6 +2945,7 @@
           <w:rFonts w:ascii="Times New Roman" w:eastAsia="Times New Roman" w:hAnsi="Times New Roman" w:cs="Times New Roman"/>
           <w:b/>
           <w:bCs/>
+          <w:color w:val="538135" w:themeColor="accent6" w:themeShade="BF"/>
           <w:sz w:val="36"/>
           <w:szCs w:val="36"/>
         </w:rPr>
@@ -3122,7 +3130,6 @@
           <w:sz w:val="48"/>
           <w:szCs w:val="48"/>
         </w:rPr>
-        <w:lastRenderedPageBreak/>
         <w:t xml:space="preserve">🟣 PHASE 2 — AI + </w:t>
       </w:r>
       <w:proofErr w:type="spellStart"/>
@@ -3613,6 +3620,7 @@
           <w:sz w:val="24"/>
           <w:szCs w:val="24"/>
         </w:rPr>
+        <w:lastRenderedPageBreak/>
         <w:t>Resume text</w:t>
       </w:r>
     </w:p>
@@ -3754,7 +3762,6 @@
           <w:sz w:val="24"/>
           <w:szCs w:val="24"/>
         </w:rPr>
-        <w:lastRenderedPageBreak/>
         <w:t>Prompt model to:</w:t>
       </w:r>
     </w:p>
@@ -4357,6 +4364,7 @@
           <w:sz w:val="24"/>
           <w:szCs w:val="24"/>
         </w:rPr>
+        <w:lastRenderedPageBreak/>
         <w:pict>
           <v:rect id="_x0000_i1042" style="width:0;height:1.5pt" o:hralign="center" o:hrstd="t" o:hr="t" fillcolor="#a0a0a0" stroked="f"/>
         </w:pict>
@@ -4490,7 +4498,6 @@
           <w:sz w:val="24"/>
           <w:szCs w:val="24"/>
         </w:rPr>
-        <w:lastRenderedPageBreak/>
         <w:pict>
           <v:rect id="_x0000_i1043" style="width:0;height:1.5pt" o:hralign="center" o:hrstd="t" o:hr="t" fillcolor="#a0a0a0" stroked="f"/>
         </w:pict>
@@ -5027,6 +5034,7 @@
           <w:sz w:val="24"/>
           <w:szCs w:val="24"/>
         </w:rPr>
+        <w:lastRenderedPageBreak/>
         <w:t>Build:</w:t>
       </w:r>
     </w:p>
@@ -5190,7 +5198,6 @@
           <w:sz w:val="24"/>
           <w:szCs w:val="24"/>
         </w:rPr>
-        <w:lastRenderedPageBreak/>
         <w:t>Drag &amp; drop</w:t>
       </w:r>
     </w:p>
@@ -5677,6 +5684,7 @@
           <w:sz w:val="36"/>
           <w:szCs w:val="36"/>
         </w:rPr>
+        <w:lastRenderedPageBreak/>
         <w:t>🎨</w:t>
       </w:r>
       <w:r>
@@ -5824,7 +5832,6 @@
           <w:sz w:val="24"/>
           <w:szCs w:val="24"/>
         </w:rPr>
-        <w:lastRenderedPageBreak/>
         <w:t>Add charts:</w:t>
       </w:r>
     </w:p>
@@ -6242,6 +6249,7 @@
           <w:sz w:val="24"/>
           <w:szCs w:val="24"/>
         </w:rPr>
+        <w:lastRenderedPageBreak/>
         <w:t>Fix CORS</w:t>
       </w:r>
     </w:p>
@@ -6433,7 +6441,6 @@
           <w:sz w:val="24"/>
           <w:szCs w:val="24"/>
         </w:rPr>
-        <w:lastRenderedPageBreak/>
         <w:pict>
           <v:rect id="_x0000_i1057" style="width:0;height:1.5pt" o:hralign="center" o:hrstd="t" o:hr="t" fillcolor="#a0a0a0" stroked="f"/>
         </w:pict>
@@ -6839,6 +6846,7 @@
                 <w:sz w:val="24"/>
                 <w:szCs w:val="24"/>
               </w:rPr>
+              <w:lastRenderedPageBreak/>
               <w:t>Phase</w:t>
             </w:r>
           </w:p>

</xml_diff>